<commit_message>
Refactor CSS styles for anime movies page and landing page
</commit_message>
<xml_diff>
--- a/asignaturas/DIW/ACTIVIDADES/HALLOWEEN/prototipado.docx
+++ b/asignaturas/DIW/ACTIVIDADES/HALLOWEEN/prototipado.docx
@@ -3,8 +3,6 @@
 <w:document xmlns:wpc="http://schemas.microsoft.com/office/word/2010/wordprocessingCanvas" xmlns:cx="http://schemas.microsoft.com/office/drawing/2014/chartex" xmlns:cx1="http://schemas.microsoft.com/office/drawing/2015/9/8/chartex" xmlns:cx2="http://schemas.microsoft.com/office/drawing/2015/10/21/chartex" xmlns:cx3="http://schemas.microsoft.com/office/drawing/2016/5/9/chartex" xmlns:cx4="http://schemas.microsoft.com/office/drawing/2016/5/10/chartex" xmlns:cx5="http://schemas.microsoft.com/office/drawing/2016/5/11/chartex" xmlns:cx6="http://schemas.microsoft.com/office/drawing/2016/5/12/chartex" xmlns:cx7="http://schemas.microsoft.com/office/drawing/2016/5/13/chartex" xmlns:cx8="http://schemas.microsoft.com/office/drawing/2016/5/14/chartex" xmlns:mc="http://schemas.openxmlformats.org/markup-compatibility/2006" xmlns:aink="http://schemas.microsoft.com/office/drawing/2016/ink" xmlns:am3d="http://schemas.microsoft.com/office/drawing/2017/model3d" xmlns:o="urn:schemas-microsoft-com:office:office" xmlns:r="http://schemas.openxmlformats.org/officeDocument/2006/relationships" xmlns:m="http://schemas.openxmlformats.org/officeDocument/2006/math" xmlns:v="urn:schemas-microsoft-com:vml" xmlns:wp14="http://schemas.microsoft.com/office/word/2010/wordprocessingDrawing" xmlns:wp="http://schemas.openxmlformats.org/drawingml/2006/wordprocessingDrawing" xmlns:w10="urn:schemas-microsoft-com:office:word" xmlns:w="http://schemas.openxmlformats.org/wordprocessingml/2006/main" xmlns:w14="http://schemas.microsoft.com/office/word/2010/wordml" xmlns:w15="http://schemas.microsoft.com/office/word/2012/wordml" xmlns:w16cid="http://schemas.microsoft.com/office/word/2016/wordml/cid" xmlns:w16se="http://schemas.microsoft.com/office/word/2015/wordml/symex" xmlns:wpg="http://schemas.microsoft.com/office/word/2010/wordprocessingGroup" xmlns:wpi="http://schemas.microsoft.com/office/word/2010/wordprocessingInk" xmlns:wne="http://schemas.microsoft.com/office/word/2006/wordml" xmlns:wps="http://schemas.microsoft.com/office/word/2010/wordprocessingShape" mc:Ignorable="w14 w15 w16se w16cid wp14">
   <w:body>
     <w:p>
-      <w:bookmarkStart w:id="0" w:name="_GoBack"/>
-      <w:bookmarkEnd w:id="0"/>
       <w:r>
         <w:rPr>
           <w:noProof/>
@@ -12,45 +10,46 @@
         <mc:AlternateContent>
           <mc:Choice Requires="wps">
             <w:drawing>
-              <wp:anchor distT="0" distB="0" distL="114300" distR="114300" simplePos="0" relativeHeight="251670528" behindDoc="0" locked="0" layoutInCell="1" allowOverlap="1" wp14:anchorId="3BA98F1E" wp14:editId="72E43FE5">
+              <wp:anchor distT="0" distB="0" distL="114300" distR="114300" simplePos="0" relativeHeight="251679744" behindDoc="0" locked="0" layoutInCell="1" allowOverlap="1" wp14:anchorId="5E1A593E" wp14:editId="33DE9277">
                 <wp:simplePos x="0" y="0"/>
                 <wp:positionH relativeFrom="column">
-                  <wp:posOffset>16454755</wp:posOffset>
+                  <wp:posOffset>16386175</wp:posOffset>
                 </wp:positionH>
-                <wp:positionV relativeFrom="paragraph">
-                  <wp:posOffset>1034415</wp:posOffset>
+                <wp:positionV relativeFrom="page">
+                  <wp:posOffset>1228090</wp:posOffset>
                 </wp:positionV>
-                <wp:extent cx="1938655" cy="346710"/>
-                <wp:effectExtent l="0" t="0" r="0" b="0"/>
+                <wp:extent cx="3027045" cy="1588135"/>
+                <wp:effectExtent l="0" t="0" r="20955" b="12065"/>
                 <wp:wrapNone/>
-                <wp:docPr id="12" name="Cuadro de texto 12"/>
-                <wp:cNvGraphicFramePr/>
+                <wp:docPr id="18" name="Rectángulo 18"/>
+                <wp:cNvGraphicFramePr>
+                  <a:graphicFrameLocks xmlns:a="http://schemas.openxmlformats.org/drawingml/2006/main" noChangeAspect="1"/>
+                </wp:cNvGraphicFramePr>
                 <a:graphic xmlns:a="http://schemas.openxmlformats.org/drawingml/2006/main">
                   <a:graphicData uri="http://schemas.microsoft.com/office/word/2010/wordprocessingShape">
                     <wps:wsp>
-                      <wps:cNvSpPr txBox="1"/>
+                      <wps:cNvSpPr>
+                        <a:spLocks noChangeAspect="1"/>
+                      </wps:cNvSpPr>
                       <wps:spPr>
                         <a:xfrm>
                           <a:off x="0" y="0"/>
-                          <a:ext cx="1938655" cy="346710"/>
+                          <a:ext cx="3027045" cy="1588135"/>
                         </a:xfrm>
                         <a:prstGeom prst="rect">
                           <a:avLst/>
                         </a:prstGeom>
                         <a:noFill/>
-                        <a:ln>
-                          <a:noFill/>
-                        </a:ln>
                       </wps:spPr>
                       <wps:style>
-                        <a:lnRef idx="0">
-                          <a:scrgbClr r="0" g="0" b="0"/>
+                        <a:lnRef idx="2">
+                          <a:schemeClr val="accent2"/>
                         </a:lnRef>
-                        <a:fillRef idx="0">
-                          <a:scrgbClr r="0" g="0" b="0"/>
+                        <a:fillRef idx="1">
+                          <a:schemeClr val="lt1"/>
                         </a:fillRef>
                         <a:effectRef idx="0">
-                          <a:scrgbClr r="0" g="0" b="0"/>
+                          <a:schemeClr val="accent2"/>
                         </a:effectRef>
                         <a:fontRef idx="minor">
                           <a:schemeClr val="dk1"/>
@@ -60,24 +59,45 @@
                         <w:txbxContent>
                           <w:p>
                             <w:pPr>
+                              <w:jc w:val="center"/>
                               <w:rPr>
                                 <w:rFonts w:ascii="Times New Roman" w:hAnsi="Times New Roman" w:cs="Times New Roman"/>
-                                <w:sz w:val="34"/>
-                                <w:szCs w:val="34"/>
+                                <w:color w:val="FFFFFF" w:themeColor="background1"/>
+                                <w:sz w:val="80"/>
+                                <w:szCs w:val="80"/>
                               </w:rPr>
                             </w:pPr>
                             <w:r>
                               <w:rPr>
                                 <w:rFonts w:ascii="Times New Roman" w:hAnsi="Times New Roman" w:cs="Times New Roman"/>
-                                <w:sz w:val="34"/>
-                                <w:szCs w:val="34"/>
+                                <w:color w:val="FFFFFF" w:themeColor="background1"/>
+                                <w:sz w:val="80"/>
+                                <w:szCs w:val="80"/>
                               </w:rPr>
-                              <w:t>NAVEGACION</w:t>
+                              <w:t>353</w:t>
+                            </w:r>
+                            <w:r>
+                              <w:rPr>
+                                <w:rFonts w:ascii="Times New Roman" w:hAnsi="Times New Roman" w:cs="Times New Roman"/>
+                                <w:color w:val="FFFFFF" w:themeColor="background1"/>
+                                <w:sz w:val="80"/>
+                                <w:szCs w:val="80"/>
+                              </w:rPr>
+                              <w:t xml:space="preserve"> x </w:t>
+                            </w:r>
+                            <w:r>
+                              <w:rPr>
+                                <w:rFonts w:ascii="Times New Roman" w:hAnsi="Times New Roman" w:cs="Times New Roman"/>
+                                <w:color w:val="FFFFFF" w:themeColor="background1"/>
+                                <w:sz w:val="80"/>
+                                <w:szCs w:val="80"/>
+                              </w:rPr>
+                              <w:t>44</w:t>
                             </w:r>
                           </w:p>
                         </w:txbxContent>
                       </wps:txbx>
-                      <wps:bodyPr rot="0" spcFirstLastPara="0" vertOverflow="overflow" horzOverflow="overflow" vert="horz" wrap="none" lIns="91440" tIns="45720" rIns="91440" bIns="45720" numCol="1" spcCol="0" rtlCol="0" fromWordArt="0" anchor="t" anchorCtr="0" forceAA="0" compatLnSpc="1">
+                      <wps:bodyPr rot="0" spcFirstLastPara="0" vertOverflow="overflow" horzOverflow="overflow" vert="horz" wrap="square" lIns="91440" tIns="45720" rIns="91440" bIns="45720" numCol="1" spcCol="0" rtlCol="0" fromWordArt="0" anchor="ctr" anchorCtr="0" forceAA="0" compatLnSpc="1">
                         <a:prstTxWarp prst="textNoShape">
                           <a:avLst/>
                         </a:prstTxWarp>
@@ -97,152 +117,53 @@
           </mc:Choice>
           <mc:Fallback>
             <w:pict>
-              <v:shapetype w14:anchorId="3BA98F1E" id="_x0000_t202" coordsize="21600,21600" o:spt="202" path="m,l,21600r21600,l21600,xe">
-                <v:stroke joinstyle="miter"/>
-                <v:path gradientshapeok="t" o:connecttype="rect"/>
-              </v:shapetype>
-              <v:shape id="Cuadro de texto 12" o:spid="_x0000_s1026" type="#_x0000_t202" style="position:absolute;margin-left:1295.65pt;margin-top:81.45pt;width:152.65pt;height:27.3pt;z-index:251670528;visibility:visible;mso-wrap-style:none;mso-width-percent:0;mso-height-percent:0;mso-wrap-distance-left:9pt;mso-wrap-distance-top:0;mso-wrap-distance-right:9pt;mso-wrap-distance-bottom:0;mso-position-horizontal:absolute;mso-position-horizontal-relative:text;mso-position-vertical:absolute;mso-position-vertical-relative:text;mso-width-percent:0;mso-height-percent:0;mso-width-relative:margin;mso-height-relative:margin;v-text-anchor:top" o:gfxdata="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" filled="f" stroked="f">
+              <v:rect w14:anchorId="5E1A593E" id="Rectángulo 18" o:spid="_x0000_s1026" style="position:absolute;margin-left:1290.25pt;margin-top:96.7pt;width:238.35pt;height:125.05pt;z-index:251679744;visibility:visible;mso-wrap-style:square;mso-width-percent:0;mso-height-percent:0;mso-wrap-distance-left:9pt;mso-wrap-distance-top:0;mso-wrap-distance-right:9pt;mso-wrap-distance-bottom:0;mso-position-horizontal:absolute;mso-position-horizontal-relative:text;mso-position-vertical:absolute;mso-position-vertical-relative:page;mso-width-percent:0;mso-height-percent:0;mso-width-relative:margin;mso-height-relative:margin;v-text-anchor:middle" o:gfxdata="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" filled="f" strokecolor="#ed7d31 [3205]" strokeweight="1pt">
+                <v:path arrowok="t"/>
+                <o:lock v:ext="edit" aspectratio="t"/>
                 <v:textbox>
                   <w:txbxContent>
                     <w:p>
                       <w:pPr>
+                        <w:jc w:val="center"/>
                         <w:rPr>
                           <w:rFonts w:ascii="Times New Roman" w:hAnsi="Times New Roman" w:cs="Times New Roman"/>
-                          <w:sz w:val="34"/>
-                          <w:szCs w:val="34"/>
+                          <w:color w:val="FFFFFF" w:themeColor="background1"/>
+                          <w:sz w:val="80"/>
+                          <w:szCs w:val="80"/>
                         </w:rPr>
                       </w:pPr>
                       <w:r>
                         <w:rPr>
                           <w:rFonts w:ascii="Times New Roman" w:hAnsi="Times New Roman" w:cs="Times New Roman"/>
-                          <w:sz w:val="34"/>
-                          <w:szCs w:val="34"/>
+                          <w:color w:val="FFFFFF" w:themeColor="background1"/>
+                          <w:sz w:val="80"/>
+                          <w:szCs w:val="80"/>
                         </w:rPr>
-                        <w:t>NAVEGACION</w:t>
+                        <w:t>353</w:t>
+                      </w:r>
+                      <w:r>
+                        <w:rPr>
+                          <w:rFonts w:ascii="Times New Roman" w:hAnsi="Times New Roman" w:cs="Times New Roman"/>
+                          <w:color w:val="FFFFFF" w:themeColor="background1"/>
+                          <w:sz w:val="80"/>
+                          <w:szCs w:val="80"/>
+                        </w:rPr>
+                        <w:t xml:space="preserve"> x </w:t>
+                      </w:r>
+                      <w:r>
+                        <w:rPr>
+                          <w:rFonts w:ascii="Times New Roman" w:hAnsi="Times New Roman" w:cs="Times New Roman"/>
+                          <w:color w:val="FFFFFF" w:themeColor="background1"/>
+                          <w:sz w:val="80"/>
+                          <w:szCs w:val="80"/>
+                        </w:rPr>
+                        <w:t>44</w:t>
                       </w:r>
                     </w:p>
                   </w:txbxContent>
                 </v:textbox>
-              </v:shape>
-            </w:pict>
-          </mc:Fallback>
-        </mc:AlternateContent>
-      </w:r>
-      <w:r>
-        <w:rPr>
-          <w:noProof/>
-        </w:rPr>
-        <mc:AlternateContent>
-          <mc:Choice Requires="wps">
-            <w:drawing>
-              <wp:anchor distT="0" distB="0" distL="114300" distR="114300" simplePos="0" relativeHeight="251668480" behindDoc="0" locked="0" layoutInCell="1" allowOverlap="1">
-                <wp:simplePos x="0" y="0"/>
-                <wp:positionH relativeFrom="column">
-                  <wp:posOffset>329565</wp:posOffset>
-                </wp:positionH>
-                <wp:positionV relativeFrom="paragraph">
-                  <wp:posOffset>1024255</wp:posOffset>
-                </wp:positionV>
-                <wp:extent cx="1938655" cy="346710"/>
-                <wp:effectExtent l="0" t="0" r="0" b="0"/>
-                <wp:wrapNone/>
-                <wp:docPr id="11" name="Cuadro de texto 11"/>
-                <wp:cNvGraphicFramePr/>
-                <a:graphic xmlns:a="http://schemas.openxmlformats.org/drawingml/2006/main">
-                  <a:graphicData uri="http://schemas.microsoft.com/office/word/2010/wordprocessingShape">
-                    <wps:wsp>
-                      <wps:cNvSpPr txBox="1"/>
-                      <wps:spPr>
-                        <a:xfrm>
-                          <a:off x="0" y="0"/>
-                          <a:ext cx="1938655" cy="346710"/>
-                        </a:xfrm>
-                        <a:prstGeom prst="rect">
-                          <a:avLst/>
-                        </a:prstGeom>
-                        <a:noFill/>
-                        <a:ln>
-                          <a:noFill/>
-                        </a:ln>
-                      </wps:spPr>
-                      <wps:style>
-                        <a:lnRef idx="0">
-                          <a:scrgbClr r="0" g="0" b="0"/>
-                        </a:lnRef>
-                        <a:fillRef idx="0">
-                          <a:scrgbClr r="0" g="0" b="0"/>
-                        </a:fillRef>
-                        <a:effectRef idx="0">
-                          <a:scrgbClr r="0" g="0" b="0"/>
-                        </a:effectRef>
-                        <a:fontRef idx="minor">
-                          <a:schemeClr val="dk1"/>
-                        </a:fontRef>
-                      </wps:style>
-                      <wps:txbx>
-                        <w:txbxContent>
-                          <w:p>
-                            <w:pPr>
-                              <w:rPr>
-                                <w:rFonts w:ascii="Times New Roman" w:hAnsi="Times New Roman" w:cs="Times New Roman"/>
-                                <w:sz w:val="34"/>
-                                <w:szCs w:val="34"/>
-                              </w:rPr>
-                            </w:pPr>
-                            <w:r>
-                              <w:rPr>
-                                <w:rFonts w:ascii="Times New Roman" w:hAnsi="Times New Roman" w:cs="Times New Roman"/>
-                                <w:sz w:val="34"/>
-                                <w:szCs w:val="34"/>
-                              </w:rPr>
-                              <w:t>Imagen del logo + Nombre del logo</w:t>
-                            </w:r>
-                          </w:p>
-                        </w:txbxContent>
-                      </wps:txbx>
-                      <wps:bodyPr rot="0" spcFirstLastPara="0" vertOverflow="overflow" horzOverflow="overflow" vert="horz" wrap="none" lIns="91440" tIns="45720" rIns="91440" bIns="45720" numCol="1" spcCol="0" rtlCol="0" fromWordArt="0" anchor="t" anchorCtr="0" forceAA="0" compatLnSpc="1">
-                        <a:prstTxWarp prst="textNoShape">
-                          <a:avLst/>
-                        </a:prstTxWarp>
-                        <a:noAutofit/>
-                      </wps:bodyPr>
-                    </wps:wsp>
-                  </a:graphicData>
-                </a:graphic>
-                <wp14:sizeRelH relativeFrom="margin">
-                  <wp14:pctWidth>0</wp14:pctWidth>
-                </wp14:sizeRelH>
-                <wp14:sizeRelV relativeFrom="margin">
-                  <wp14:pctHeight>0</wp14:pctHeight>
-                </wp14:sizeRelV>
-              </wp:anchor>
-            </w:drawing>
-          </mc:Choice>
-          <mc:Fallback>
-            <w:pict>
-              <v:shape id="Cuadro de texto 11" o:spid="_x0000_s1027" type="#_x0000_t202" style="position:absolute;margin-left:25.95pt;margin-top:80.65pt;width:152.65pt;height:27.3pt;z-index:251668480;visibility:visible;mso-wrap-style:none;mso-width-percent:0;mso-height-percent:0;mso-wrap-distance-left:9pt;mso-wrap-distance-top:0;mso-wrap-distance-right:9pt;mso-wrap-distance-bottom:0;mso-position-horizontal:absolute;mso-position-horizontal-relative:text;mso-position-vertical:absolute;mso-position-vertical-relative:text;mso-width-percent:0;mso-height-percent:0;mso-width-relative:margin;mso-height-relative:margin;v-text-anchor:top" o:gfxdata="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" filled="f" stroked="f">
-                <v:textbox>
-                  <w:txbxContent>
-                    <w:p>
-                      <w:pPr>
-                        <w:rPr>
-                          <w:rFonts w:ascii="Times New Roman" w:hAnsi="Times New Roman" w:cs="Times New Roman"/>
-                          <w:sz w:val="34"/>
-                          <w:szCs w:val="34"/>
-                        </w:rPr>
-                      </w:pPr>
-                      <w:r>
-                        <w:rPr>
-                          <w:rFonts w:ascii="Times New Roman" w:hAnsi="Times New Roman" w:cs="Times New Roman"/>
-                          <w:sz w:val="34"/>
-                          <w:szCs w:val="34"/>
-                        </w:rPr>
-                        <w:t>Imagen del logo + Nombre del logo</w:t>
-                      </w:r>
-                    </w:p>
-                  </w:txbxContent>
-                </v:textbox>
-              </v:shape>
+                <w10:wrap anchory="page"/>
+              </v:rect>
             </w:pict>
           </mc:Fallback>
         </mc:AlternateContent>
@@ -257,10 +178,10 @@
               <wp:anchor distT="0" distB="0" distL="114300" distR="114300" simplePos="0" relativeHeight="251667456" behindDoc="0" locked="0" layoutInCell="1" allowOverlap="1" wp14:anchorId="1A606A70" wp14:editId="7FE01490">
                 <wp:simplePos x="0" y="0"/>
                 <wp:positionH relativeFrom="column">
-                  <wp:posOffset>55880</wp:posOffset>
+                  <wp:posOffset>88900</wp:posOffset>
                 </wp:positionH>
                 <wp:positionV relativeFrom="paragraph">
-                  <wp:posOffset>1586865</wp:posOffset>
+                  <wp:posOffset>3696970</wp:posOffset>
                 </wp:positionV>
                 <wp:extent cx="20132040" cy="5080"/>
                 <wp:effectExtent l="0" t="0" r="22860" b="33020"/>
@@ -318,7 +239,258 @@
           </mc:Choice>
           <mc:Fallback>
             <w:pict>
-              <v:line w14:anchorId="4D427DAA" id="Conector recto 10" o:spid="_x0000_s1026" style="position:absolute;flip:y;z-index:251667456;visibility:visible;mso-wrap-style:square;mso-width-percent:0;mso-height-percent:0;mso-wrap-distance-left:9pt;mso-wrap-distance-top:0;mso-wrap-distance-right:9pt;mso-wrap-distance-bottom:0;mso-position-horizontal:absolute;mso-position-horizontal-relative:text;mso-position-vertical:absolute;mso-position-vertical-relative:text;mso-width-percent:0;mso-height-percent:0;mso-width-relative:margin;mso-height-relative:margin" from="4.4pt,124.95pt" to="1589.6pt,125.35pt" o:gfxdata="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" strokecolor="#a5a5a5 [3206]"/>
+              <v:line w14:anchorId="40B2A8AE" id="Conector recto 10" o:spid="_x0000_s1026" style="position:absolute;flip:y;z-index:251667456;visibility:visible;mso-wrap-style:square;mso-width-percent:0;mso-height-percent:0;mso-wrap-distance-left:9pt;mso-wrap-distance-top:0;mso-wrap-distance-right:9pt;mso-wrap-distance-bottom:0;mso-position-horizontal:absolute;mso-position-horizontal-relative:text;mso-position-vertical:absolute;mso-position-vertical-relative:text;mso-width-percent:0;mso-height-percent:0;mso-width-relative:margin;mso-height-relative:margin" from="7pt,291.1pt" to="1592.2pt,291.5pt" o:gfxdata="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" strokecolor="#a5a5a5 [3206]"/>
+            </w:pict>
+          </mc:Fallback>
+        </mc:AlternateContent>
+      </w:r>
+      <w:r>
+        <w:rPr>
+          <w:noProof/>
+        </w:rPr>
+        <mc:AlternateContent>
+          <mc:Choice Requires="wps">
+            <w:drawing>
+              <wp:anchor distT="0" distB="0" distL="114300" distR="114300" simplePos="0" relativeHeight="251677696" behindDoc="0" locked="0" layoutInCell="1" allowOverlap="1" wp14:anchorId="0B3449DA" wp14:editId="7001E04C">
+                <wp:simplePos x="0" y="0"/>
+                <wp:positionH relativeFrom="column">
+                  <wp:posOffset>285033</wp:posOffset>
+                </wp:positionH>
+                <wp:positionV relativeFrom="page">
+                  <wp:posOffset>935990</wp:posOffset>
+                </wp:positionV>
+                <wp:extent cx="3027600" cy="2577600"/>
+                <wp:effectExtent l="0" t="0" r="20955" b="13335"/>
+                <wp:wrapNone/>
+                <wp:docPr id="15" name="Rectángulo 15"/>
+                <wp:cNvGraphicFramePr>
+                  <a:graphicFrameLocks xmlns:a="http://schemas.openxmlformats.org/drawingml/2006/main" noChangeAspect="1"/>
+                </wp:cNvGraphicFramePr>
+                <a:graphic xmlns:a="http://schemas.openxmlformats.org/drawingml/2006/main">
+                  <a:graphicData uri="http://schemas.microsoft.com/office/word/2010/wordprocessingShape">
+                    <wps:wsp>
+                      <wps:cNvSpPr>
+                        <a:spLocks noChangeAspect="1"/>
+                      </wps:cNvSpPr>
+                      <wps:spPr>
+                        <a:xfrm>
+                          <a:off x="0" y="0"/>
+                          <a:ext cx="3027600" cy="2577600"/>
+                        </a:xfrm>
+                        <a:prstGeom prst="rect">
+                          <a:avLst/>
+                        </a:prstGeom>
+                        <a:noFill/>
+                      </wps:spPr>
+                      <wps:style>
+                        <a:lnRef idx="2">
+                          <a:schemeClr val="accent2"/>
+                        </a:lnRef>
+                        <a:fillRef idx="1">
+                          <a:schemeClr val="lt1"/>
+                        </a:fillRef>
+                        <a:effectRef idx="0">
+                          <a:schemeClr val="accent2"/>
+                        </a:effectRef>
+                        <a:fontRef idx="minor">
+                          <a:schemeClr val="dk1"/>
+                        </a:fontRef>
+                      </wps:style>
+                      <wps:txbx>
+                        <w:txbxContent>
+                          <w:p>
+                            <w:pPr>
+                              <w:jc w:val="center"/>
+                              <w:rPr>
+                                <w:rFonts w:ascii="Times New Roman" w:hAnsi="Times New Roman" w:cs="Times New Roman"/>
+                                <w:color w:val="FFFFFF" w:themeColor="background1"/>
+                                <w:sz w:val="80"/>
+                                <w:szCs w:val="80"/>
+                              </w:rPr>
+                            </w:pPr>
+                            <w:r>
+                              <w:rPr>
+                                <w:rFonts w:ascii="Times New Roman" w:hAnsi="Times New Roman" w:cs="Times New Roman"/>
+                                <w:color w:val="FFFFFF" w:themeColor="background1"/>
+                                <w:sz w:val="80"/>
+                                <w:szCs w:val="80"/>
+                              </w:rPr>
+                              <w:t>100 x 100</w:t>
+                            </w:r>
+                          </w:p>
+                        </w:txbxContent>
+                      </wps:txbx>
+                      <wps:bodyPr rot="0" spcFirstLastPara="0" vertOverflow="overflow" horzOverflow="overflow" vert="horz" wrap="square" lIns="91440" tIns="45720" rIns="91440" bIns="45720" numCol="1" spcCol="0" rtlCol="0" fromWordArt="0" anchor="ctr" anchorCtr="0" forceAA="0" compatLnSpc="1">
+                        <a:prstTxWarp prst="textNoShape">
+                          <a:avLst/>
+                        </a:prstTxWarp>
+                        <a:noAutofit/>
+                      </wps:bodyPr>
+                    </wps:wsp>
+                  </a:graphicData>
+                </a:graphic>
+                <wp14:sizeRelH relativeFrom="margin">
+                  <wp14:pctWidth>0</wp14:pctWidth>
+                </wp14:sizeRelH>
+                <wp14:sizeRelV relativeFrom="margin">
+                  <wp14:pctHeight>0</wp14:pctHeight>
+                </wp14:sizeRelV>
+              </wp:anchor>
+            </w:drawing>
+          </mc:Choice>
+          <mc:Fallback>
+            <w:pict>
+              <v:rect w14:anchorId="0B3449DA" id="Rectángulo 15" o:spid="_x0000_s1027" style="position:absolute;margin-left:22.45pt;margin-top:73.7pt;width:238.4pt;height:202.95pt;z-index:251677696;visibility:visible;mso-wrap-style:square;mso-width-percent:0;mso-height-percent:0;mso-wrap-distance-left:9pt;mso-wrap-distance-top:0;mso-wrap-distance-right:9pt;mso-wrap-distance-bottom:0;mso-position-horizontal:absolute;mso-position-horizontal-relative:text;mso-position-vertical:absolute;mso-position-vertical-relative:page;mso-width-percent:0;mso-height-percent:0;mso-width-relative:margin;mso-height-relative:margin;v-text-anchor:middle" o:gfxdata="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" filled="f" strokecolor="#ed7d31 [3205]" strokeweight="1pt">
+                <v:path arrowok="t"/>
+                <o:lock v:ext="edit" aspectratio="t"/>
+                <v:textbox>
+                  <w:txbxContent>
+                    <w:p>
+                      <w:pPr>
+                        <w:jc w:val="center"/>
+                        <w:rPr>
+                          <w:rFonts w:ascii="Times New Roman" w:hAnsi="Times New Roman" w:cs="Times New Roman"/>
+                          <w:color w:val="FFFFFF" w:themeColor="background1"/>
+                          <w:sz w:val="80"/>
+                          <w:szCs w:val="80"/>
+                        </w:rPr>
+                      </w:pPr>
+                      <w:r>
+                        <w:rPr>
+                          <w:rFonts w:ascii="Times New Roman" w:hAnsi="Times New Roman" w:cs="Times New Roman"/>
+                          <w:color w:val="FFFFFF" w:themeColor="background1"/>
+                          <w:sz w:val="80"/>
+                          <w:szCs w:val="80"/>
+                        </w:rPr>
+                        <w:t>100 x 100</w:t>
+                      </w:r>
+                    </w:p>
+                  </w:txbxContent>
+                </v:textbox>
+                <w10:wrap anchory="page"/>
+              </v:rect>
+            </w:pict>
+          </mc:Fallback>
+        </mc:AlternateContent>
+      </w:r>
+      <w:r>
+        <w:rPr>
+          <w:noProof/>
+        </w:rPr>
+        <mc:AlternateContent>
+          <mc:Choice Requires="wps">
+            <w:drawing>
+              <wp:anchor distT="0" distB="0" distL="114300" distR="114300" simplePos="0" relativeHeight="251671552" behindDoc="0" locked="0" layoutInCell="1" allowOverlap="1">
+                <wp:simplePos x="0" y="0"/>
+                <wp:positionH relativeFrom="column">
+                  <wp:posOffset>865505</wp:posOffset>
+                </wp:positionH>
+                <wp:positionV relativeFrom="paragraph">
+                  <wp:posOffset>4058285</wp:posOffset>
+                </wp:positionV>
+                <wp:extent cx="18432145" cy="1178560"/>
+                <wp:effectExtent l="0" t="0" r="27305" b="21590"/>
+                <wp:wrapNone/>
+                <wp:docPr id="2" name="Rectángulo 2"/>
+                <wp:cNvGraphicFramePr/>
+                <a:graphic xmlns:a="http://schemas.openxmlformats.org/drawingml/2006/main">
+                  <a:graphicData uri="http://schemas.microsoft.com/office/word/2010/wordprocessingShape">
+                    <wps:wsp>
+                      <wps:cNvSpPr/>
+                      <wps:spPr>
+                        <a:xfrm>
+                          <a:off x="0" y="0"/>
+                          <a:ext cx="18432145" cy="1178560"/>
+                        </a:xfrm>
+                        <a:prstGeom prst="rect">
+                          <a:avLst/>
+                        </a:prstGeom>
+                        <a:noFill/>
+                      </wps:spPr>
+                      <wps:style>
+                        <a:lnRef idx="2">
+                          <a:schemeClr val="accent2"/>
+                        </a:lnRef>
+                        <a:fillRef idx="1">
+                          <a:schemeClr val="lt1"/>
+                        </a:fillRef>
+                        <a:effectRef idx="0">
+                          <a:schemeClr val="accent2"/>
+                        </a:effectRef>
+                        <a:fontRef idx="minor">
+                          <a:schemeClr val="dk1"/>
+                        </a:fontRef>
+                      </wps:style>
+                      <wps:txbx>
+                        <w:txbxContent>
+                          <w:p>
+                            <w:pPr>
+                              <w:jc w:val="center"/>
+                              <w:rPr>
+                                <w:rFonts w:ascii="Times New Roman" w:hAnsi="Times New Roman" w:cs="Times New Roman"/>
+                                <w:color w:val="FFFFFF" w:themeColor="background1"/>
+                                <w:sz w:val="80"/>
+                                <w:szCs w:val="80"/>
+                              </w:rPr>
+                            </w:pPr>
+                            <w:r>
+                              <w:rPr>
+                                <w:rFonts w:ascii="Times New Roman" w:hAnsi="Times New Roman" w:cs="Times New Roman"/>
+                                <w:color w:val="FFFFFF" w:themeColor="background1"/>
+                                <w:sz w:val="80"/>
+                                <w:szCs w:val="80"/>
+                              </w:rPr>
+                              <w:t>512 x 154</w:t>
+                            </w:r>
+                          </w:p>
+                        </w:txbxContent>
+                      </wps:txbx>
+                      <wps:bodyPr rot="0" spcFirstLastPara="0" vertOverflow="overflow" horzOverflow="overflow" vert="horz" wrap="square" lIns="91440" tIns="45720" rIns="91440" bIns="45720" numCol="1" spcCol="0" rtlCol="0" fromWordArt="0" anchor="ctr" anchorCtr="0" forceAA="0" compatLnSpc="1">
+                        <a:prstTxWarp prst="textNoShape">
+                          <a:avLst/>
+                        </a:prstTxWarp>
+                        <a:noAutofit/>
+                      </wps:bodyPr>
+                    </wps:wsp>
+                  </a:graphicData>
+                </a:graphic>
+                <wp14:sizeRelH relativeFrom="margin">
+                  <wp14:pctWidth>0</wp14:pctWidth>
+                </wp14:sizeRelH>
+                <wp14:sizeRelV relativeFrom="margin">
+                  <wp14:pctHeight>0</wp14:pctHeight>
+                </wp14:sizeRelV>
+              </wp:anchor>
+            </w:drawing>
+          </mc:Choice>
+          <mc:Fallback>
+            <w:pict>
+              <v:rect id="Rectángulo 2" o:spid="_x0000_s1028" style="position:absolute;margin-left:68.15pt;margin-top:319.55pt;width:1451.35pt;height:92.8pt;z-index:251671552;visibility:visible;mso-wrap-style:square;mso-width-percent:0;mso-height-percent:0;mso-wrap-distance-left:9pt;mso-wrap-distance-top:0;mso-wrap-distance-right:9pt;mso-wrap-distance-bottom:0;mso-position-horizontal:absolute;mso-position-horizontal-relative:text;mso-position-vertical:absolute;mso-position-vertical-relative:text;mso-width-percent:0;mso-height-percent:0;mso-width-relative:margin;mso-height-relative:margin;v-text-anchor:middle" o:gfxdata="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" filled="f" strokecolor="#ed7d31 [3205]" strokeweight="1pt">
+                <v:textbox>
+                  <w:txbxContent>
+                    <w:p>
+                      <w:pPr>
+                        <w:jc w:val="center"/>
+                        <w:rPr>
+                          <w:rFonts w:ascii="Times New Roman" w:hAnsi="Times New Roman" w:cs="Times New Roman"/>
+                          <w:color w:val="FFFFFF" w:themeColor="background1"/>
+                          <w:sz w:val="80"/>
+                          <w:szCs w:val="80"/>
+                        </w:rPr>
+                      </w:pPr>
+                      <w:r>
+                        <w:rPr>
+                          <w:rFonts w:ascii="Times New Roman" w:hAnsi="Times New Roman" w:cs="Times New Roman"/>
+                          <w:color w:val="FFFFFF" w:themeColor="background1"/>
+                          <w:sz w:val="80"/>
+                          <w:szCs w:val="80"/>
+                        </w:rPr>
+                        <w:t>512 x 154</w:t>
+                      </w:r>
+                    </w:p>
+                  </w:txbxContent>
+                </v:textbox>
+              </v:rect>
             </w:pict>
           </mc:Fallback>
         </mc:AlternateContent>
@@ -394,7 +566,7 @@
           </mc:Choice>
           <mc:Fallback>
             <w:pict>
-              <v:line w14:anchorId="626389B4" id="Conector recto 3" o:spid="_x0000_s1026" style="position:absolute;flip:y;z-index:251660288;visibility:visible;mso-wrap-style:square;mso-width-percent:0;mso-height-percent:0;mso-wrap-distance-left:9pt;mso-wrap-distance-top:0;mso-wrap-distance-right:9pt;mso-wrap-distance-bottom:0;mso-position-horizontal:absolute;mso-position-horizontal-relative:text;mso-position-vertical:absolute;mso-position-vertical-relative:text;mso-width-percent:0;mso-height-percent:0;mso-width-relative:margin;mso-height-relative:margin" from="6.2pt,62.1pt" to="1591.45pt,63.35pt" o:gfxdata="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" strokecolor="#a5a5a5 [3206]"/>
+              <v:line w14:anchorId="3BC5D43C" id="Conector recto 3" o:spid="_x0000_s1026" style="position:absolute;flip:y;z-index:251660288;visibility:visible;mso-wrap-style:square;mso-width-percent:0;mso-height-percent:0;mso-wrap-distance-left:9pt;mso-wrap-distance-top:0;mso-wrap-distance-right:9pt;mso-wrap-distance-bottom:0;mso-position-horizontal:absolute;mso-position-horizontal-relative:text;mso-position-vertical:absolute;mso-position-vertical-relative:text;mso-width-percent:0;mso-height-percent:0;mso-width-relative:margin;mso-height-relative:margin" from="6.2pt,62.1pt" to="1591.45pt,63.35pt" o:gfxdata="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" strokecolor="#a5a5a5 [3206]"/>
             </w:pict>
           </mc:Fallback>
         </mc:AlternateContent>
@@ -487,7 +659,7 @@
           </mc:Choice>
           <mc:Fallback>
             <w:pict>
-              <v:shape w14:anchorId="34AE6B97" id="Signo de multiplicación 8" o:spid="_x0000_s1028" style="position:absolute;margin-left:1534.5pt;margin-top:11.05pt;width:39.6pt;height:39.7pt;z-index:251665408;visibility:visible;mso-wrap-style:square;mso-width-percent:0;mso-wrap-distance-left:9pt;mso-wrap-distance-top:0;mso-wrap-distance-right:9pt;mso-wrap-distance-bottom:0;mso-position-horizontal:absolute;mso-position-horizontal-relative:text;mso-position-vertical:absolute;mso-position-vertical-relative:text;mso-width-percent:0;mso-width-relative:margin;v-text-anchor:middle" coordsize="502920,504190" o:spt="100" o:gfxdata="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" adj="-11796480,,5400" path="m78915,162862l162662,79326r88798,89022l340258,79326r83747,83536l334996,252095r89009,89233l340258,424864,251460,335842r-88798,89022l78915,341328r89009,-89233l78915,162862xe" fillcolor="red" strokecolor="red" strokeweight="1pt">
+              <v:shape w14:anchorId="34AE6B97" id="Signo de multiplicación 8" o:spid="_x0000_s1029" style="position:absolute;margin-left:1534.5pt;margin-top:11.05pt;width:39.6pt;height:39.7pt;z-index:251665408;visibility:visible;mso-wrap-style:square;mso-width-percent:0;mso-wrap-distance-left:9pt;mso-wrap-distance-top:0;mso-wrap-distance-right:9pt;mso-wrap-distance-bottom:0;mso-position-horizontal:absolute;mso-position-horizontal-relative:text;mso-position-vertical:absolute;mso-position-vertical-relative:text;mso-width-percent:0;mso-width-relative:margin;v-text-anchor:middle" coordsize="502920,504190" o:spt="100" o:gfxdata="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" adj="-11796480,,5400" path="m78915,162862l162662,79326r88798,89022l340258,79326r83747,83536l334996,252095r89009,89233l340258,424864,251460,335842r-88798,89022l78915,341328r89009,-89233l78915,162862xe" fillcolor="red" strokecolor="red" strokeweight="1pt">
                 <v:stroke joinstyle="miter"/>
                 <v:formulas/>
                 <v:path arrowok="t" o:connecttype="custom" o:connectlocs="78915,162862;162662,79326;251460,168348;340258,79326;424005,162862;334996,252095;424005,341328;340258,424864;251460,335842;162662,424864;78915,341328;167924,252095;78915,162862" o:connectangles="0,0,0,0,0,0,0,0,0,0,0,0,0" textboxrect="0,0,502920,504190"/>
@@ -584,7 +756,7 @@
           </mc:Choice>
           <mc:Fallback>
             <w:pict>
-              <v:rect w14:anchorId="584E4A16" id="Rectángulo 7" o:spid="_x0000_s1026" style="position:absolute;margin-left:1463.35pt;margin-top:11.5pt;width:39.6pt;height:39.7pt;z-index:251663360;visibility:visible;mso-wrap-style:square;mso-width-percent:0;mso-height-percent:0;mso-wrap-distance-left:9pt;mso-wrap-distance-top:0;mso-wrap-distance-right:9pt;mso-wrap-distance-bottom:0;mso-position-horizontal:absolute;mso-position-horizontal-relative:text;mso-position-vertical:absolute;mso-position-vertical-relative:text;mso-width-percent:0;mso-height-percent:0;mso-width-relative:margin;mso-height-relative:margin;v-text-anchor:middle" o:gfxdata="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" fillcolor="#ffc000 [3207]" strokecolor="#ffc000 [3207]" strokeweight="1pt"/>
+              <v:rect w14:anchorId="0CAB5295" id="Rectángulo 7" o:spid="_x0000_s1026" style="position:absolute;margin-left:1463.35pt;margin-top:11.5pt;width:39.6pt;height:39.7pt;z-index:251663360;visibility:visible;mso-wrap-style:square;mso-width-percent:0;mso-height-percent:0;mso-wrap-distance-left:9pt;mso-wrap-distance-top:0;mso-wrap-distance-right:9pt;mso-wrap-distance-bottom:0;mso-position-horizontal:absolute;mso-position-horizontal-relative:text;mso-position-vertical:absolute;mso-position-vertical-relative:text;mso-width-percent:0;mso-height-percent:0;mso-width-relative:margin;mso-height-relative:margin;v-text-anchor:middle" o:gfxdata="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" fillcolor="#ffc000 [3207]" strokecolor="#ffc000 [3207]" strokeweight="1pt"/>
             </w:pict>
           </mc:Fallback>
         </mc:AlternateContent>
@@ -660,7 +832,7 @@
           </mc:Choice>
           <mc:Fallback>
             <w:pict>
-              <v:shape w14:anchorId="7807D6A3" id="Signo menos 4" o:spid="_x0000_s1026" style="position:absolute;margin-left:1398.55pt;margin-top:11.9pt;width:39.6pt;height:39.7pt;z-index:251661312;visibility:visible;mso-wrap-style:square;mso-width-percent:0;mso-wrap-distance-left:9pt;mso-wrap-distance-top:0;mso-wrap-distance-right:9pt;mso-wrap-distance-bottom:0;mso-position-horizontal:absolute;mso-position-horizontal-relative:text;mso-position-vertical:absolute;mso-position-vertical-relative:text;mso-width-percent:0;mso-width-relative:margin;v-text-anchor:middle" coordsize="502920,504190" o:gfxdata="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" path="m66662,192802r369596,l436258,311388r-369596,l66662,192802xe" fillcolor="#70ad47 [3209]" strokecolor="#70ad47 [3209]" strokeweight="1pt">
+              <v:shape w14:anchorId="541B65B1" id="Signo menos 4" o:spid="_x0000_s1026" style="position:absolute;margin-left:1398.55pt;margin-top:11.9pt;width:39.6pt;height:39.7pt;z-index:251661312;visibility:visible;mso-wrap-style:square;mso-width-percent:0;mso-wrap-distance-left:9pt;mso-wrap-distance-top:0;mso-wrap-distance-right:9pt;mso-wrap-distance-bottom:0;mso-position-horizontal:absolute;mso-position-horizontal-relative:text;mso-position-vertical:absolute;mso-position-vertical-relative:text;mso-width-percent:0;mso-width-relative:margin;v-text-anchor:middle" coordsize="502920,504190" o:gfxdata="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" path="m66662,192802r369596,l436258,311388r-369596,l66662,192802xe" fillcolor="#70ad47 [3209]" strokecolor="#70ad47 [3209]" strokeweight="1pt">
                 <v:stroke joinstyle="miter"/>
                 <v:path arrowok="t" o:connecttype="custom" o:connectlocs="66662,192802;436258,192802;436258,311388;66662,311388;66662,192802" o:connectangles="0,0,0,0,0"/>
               </v:shape>
@@ -678,13 +850,13 @@
               <wp:anchor distT="0" distB="0" distL="114300" distR="114300" simplePos="0" relativeHeight="251659264" behindDoc="0" locked="0" layoutInCell="1" allowOverlap="1">
                 <wp:simplePos x="0" y="0"/>
                 <wp:positionH relativeFrom="column">
-                  <wp:posOffset>47292</wp:posOffset>
+                  <wp:posOffset>31312</wp:posOffset>
                 </wp:positionH>
                 <wp:positionV relativeFrom="paragraph">
-                  <wp:posOffset>1170</wp:posOffset>
+                  <wp:posOffset>1161</wp:posOffset>
                 </wp:positionV>
-                <wp:extent cx="20164926" cy="24562675"/>
-                <wp:effectExtent l="0" t="0" r="28575" b="12065"/>
+                <wp:extent cx="20164926" cy="25508606"/>
+                <wp:effectExtent l="0" t="0" r="28575" b="18415"/>
                 <wp:wrapNone/>
                 <wp:docPr id="1" name="Rectángulo 1"/>
                 <wp:cNvGraphicFramePr/>
@@ -695,15 +867,17 @@
                       <wps:spPr>
                         <a:xfrm>
                           <a:off x="0" y="0"/>
-                          <a:ext cx="20164926" cy="24562675"/>
+                          <a:ext cx="20164926" cy="25508606"/>
                         </a:xfrm>
                         <a:prstGeom prst="rect">
                           <a:avLst/>
                         </a:prstGeom>
-                        <a:noFill/>
+                        <a:solidFill>
+                          <a:schemeClr val="tx1"/>
+                        </a:solidFill>
                         <a:ln w="9525" cap="flat" cmpd="sng" algn="ctr">
                           <a:solidFill>
-                            <a:schemeClr val="accent3"/>
+                            <a:schemeClr val="tx1"/>
                           </a:solidFill>
                           <a:prstDash val="solid"/>
                           <a:round/>
@@ -745,8 +919,758 @@
           </mc:Choice>
           <mc:Fallback>
             <w:pict>
-              <v:rect w14:anchorId="30ACBF64" id="Rectángulo 1" o:spid="_x0000_s1026" style="position:absolute;margin-left:3.7pt;margin-top:.1pt;width:1587.8pt;height:1934.05pt;z-index:251659264;visibility:visible;mso-wrap-style:square;mso-width-percent:0;mso-height-percent:0;mso-wrap-distance-left:9pt;mso-wrap-distance-top:0;mso-wrap-distance-right:9pt;mso-wrap-distance-bottom:0;mso-position-horizontal:absolute;mso-position-horizontal-relative:text;mso-position-vertical:absolute;mso-position-vertical-relative:text;mso-width-percent:0;mso-height-percent:0;mso-width-relative:margin;mso-height-relative:margin;v-text-anchor:middle" o:gfxdata="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" filled="f" strokecolor="#a5a5a5 [3206]">
+              <v:rect w14:anchorId="7ADFB7AD" id="Rectángulo 1" o:spid="_x0000_s1026" style="position:absolute;margin-left:2.45pt;margin-top:.1pt;width:1587.8pt;height:2008.55pt;z-index:251659264;visibility:visible;mso-wrap-style:square;mso-width-percent:0;mso-height-percent:0;mso-wrap-distance-left:9pt;mso-wrap-distance-top:0;mso-wrap-distance-right:9pt;mso-wrap-distance-bottom:0;mso-position-horizontal:absolute;mso-position-horizontal-relative:text;mso-position-vertical:absolute;mso-position-vertical-relative:text;mso-width-percent:0;mso-height-percent:0;mso-width-relative:margin;mso-height-relative:margin;v-text-anchor:middle" o:gfxdata="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" fillcolor="black [3213]" strokecolor="black [3213]">
                 <v:stroke joinstyle="round"/>
+              </v:rect>
+            </w:pict>
+          </mc:Fallback>
+        </mc:AlternateContent>
+      </w:r>
+    </w:p>
+    <w:p/>
+    <w:p/>
+    <w:p/>
+    <w:p/>
+    <w:p/>
+    <w:p/>
+    <w:p/>
+    <w:p/>
+    <w:p/>
+    <w:p/>
+    <w:p/>
+    <w:p/>
+    <w:p/>
+    <w:p/>
+    <w:p/>
+    <w:p/>
+    <w:p>
+      <w:r>
+        <w:rPr>
+          <w:noProof/>
+        </w:rPr>
+        <mc:AlternateContent>
+          <mc:Choice Requires="wps">
+            <w:drawing>
+              <wp:anchor distT="0" distB="0" distL="114300" distR="114300" simplePos="0" relativeHeight="251673600" behindDoc="0" locked="0" layoutInCell="1" allowOverlap="1" wp14:anchorId="03CEAA06" wp14:editId="2A5D6D31">
+                <wp:simplePos x="0" y="0"/>
+                <wp:positionH relativeFrom="column">
+                  <wp:posOffset>6273800</wp:posOffset>
+                </wp:positionH>
+                <wp:positionV relativeFrom="paragraph">
+                  <wp:posOffset>44450</wp:posOffset>
+                </wp:positionV>
+                <wp:extent cx="7819390" cy="5516880"/>
+                <wp:effectExtent l="0" t="0" r="10160" b="26670"/>
+                <wp:wrapNone/>
+                <wp:docPr id="5" name="Rectángulo 5"/>
+                <wp:cNvGraphicFramePr/>
+                <a:graphic xmlns:a="http://schemas.openxmlformats.org/drawingml/2006/main">
+                  <a:graphicData uri="http://schemas.microsoft.com/office/word/2010/wordprocessingShape">
+                    <wps:wsp>
+                      <wps:cNvSpPr/>
+                      <wps:spPr>
+                        <a:xfrm>
+                          <a:off x="0" y="0"/>
+                          <a:ext cx="7819390" cy="5516880"/>
+                        </a:xfrm>
+                        <a:prstGeom prst="rect">
+                          <a:avLst/>
+                        </a:prstGeom>
+                        <a:noFill/>
+                        <a:ln>
+                          <a:prstDash val="sysDash"/>
+                        </a:ln>
+                      </wps:spPr>
+                      <wps:style>
+                        <a:lnRef idx="2">
+                          <a:schemeClr val="accent2"/>
+                        </a:lnRef>
+                        <a:fillRef idx="1">
+                          <a:schemeClr val="lt1"/>
+                        </a:fillRef>
+                        <a:effectRef idx="0">
+                          <a:schemeClr val="accent2"/>
+                        </a:effectRef>
+                        <a:fontRef idx="minor">
+                          <a:schemeClr val="dk1"/>
+                        </a:fontRef>
+                      </wps:style>
+                      <wps:bodyPr rot="0" spcFirstLastPara="0" vertOverflow="overflow" horzOverflow="overflow" vert="horz" wrap="square" lIns="91440" tIns="45720" rIns="91440" bIns="45720" numCol="1" spcCol="0" rtlCol="0" fromWordArt="0" anchor="ctr" anchorCtr="0" forceAA="0" compatLnSpc="1">
+                        <a:prstTxWarp prst="textNoShape">
+                          <a:avLst/>
+                        </a:prstTxWarp>
+                        <a:noAutofit/>
+                      </wps:bodyPr>
+                    </wps:wsp>
+                  </a:graphicData>
+                </a:graphic>
+                <wp14:sizeRelH relativeFrom="margin">
+                  <wp14:pctWidth>0</wp14:pctWidth>
+                </wp14:sizeRelH>
+                <wp14:sizeRelV relativeFrom="margin">
+                  <wp14:pctHeight>0</wp14:pctHeight>
+                </wp14:sizeRelV>
+              </wp:anchor>
+            </w:drawing>
+          </mc:Choice>
+          <mc:Fallback>
+            <w:pict>
+              <v:rect w14:anchorId="2B28F0E4" id="Rectángulo 5" o:spid="_x0000_s1026" style="position:absolute;margin-left:494pt;margin-top:3.5pt;width:615.7pt;height:434.4pt;z-index:251673600;visibility:visible;mso-wrap-style:square;mso-width-percent:0;mso-height-percent:0;mso-wrap-distance-left:9pt;mso-wrap-distance-top:0;mso-wrap-distance-right:9pt;mso-wrap-distance-bottom:0;mso-position-horizontal:absolute;mso-position-horizontal-relative:text;mso-position-vertical:absolute;mso-position-vertical-relative:text;mso-width-percent:0;mso-height-percent:0;mso-width-relative:margin;mso-height-relative:margin;v-text-anchor:middle" o:gfxdata="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" filled="f" strokecolor="#ed7d31 [3205]" strokeweight="1pt">
+                <v:stroke dashstyle="3 1"/>
+              </v:rect>
+            </w:pict>
+          </mc:Fallback>
+        </mc:AlternateContent>
+      </w:r>
+    </w:p>
+    <w:p>
+      <w:r>
+        <w:rPr>
+          <w:noProof/>
+        </w:rPr>
+        <mc:AlternateContent>
+          <mc:Choice Requires="wps">
+            <w:drawing>
+              <wp:anchor distT="0" distB="0" distL="114300" distR="114300" simplePos="0" relativeHeight="251681792" behindDoc="0" locked="0" layoutInCell="1" allowOverlap="1" wp14:anchorId="1C6A8B4F" wp14:editId="3E6F0D5F">
+                <wp:simplePos x="0" y="0"/>
+                <wp:positionH relativeFrom="column">
+                  <wp:posOffset>6556375</wp:posOffset>
+                </wp:positionH>
+                <wp:positionV relativeFrom="paragraph">
+                  <wp:posOffset>36195</wp:posOffset>
+                </wp:positionV>
+                <wp:extent cx="7254875" cy="4824095"/>
+                <wp:effectExtent l="0" t="0" r="22225" b="14605"/>
+                <wp:wrapNone/>
+                <wp:docPr id="19" name="Rectángulo 19"/>
+                <wp:cNvGraphicFramePr/>
+                <a:graphic xmlns:a="http://schemas.openxmlformats.org/drawingml/2006/main">
+                  <a:graphicData uri="http://schemas.microsoft.com/office/word/2010/wordprocessingShape">
+                    <wps:wsp>
+                      <wps:cNvSpPr/>
+                      <wps:spPr>
+                        <a:xfrm>
+                          <a:off x="0" y="0"/>
+                          <a:ext cx="7254875" cy="4824095"/>
+                        </a:xfrm>
+                        <a:prstGeom prst="rect">
+                          <a:avLst/>
+                        </a:prstGeom>
+                        <a:noFill/>
+                      </wps:spPr>
+                      <wps:style>
+                        <a:lnRef idx="2">
+                          <a:schemeClr val="accent2"/>
+                        </a:lnRef>
+                        <a:fillRef idx="1">
+                          <a:schemeClr val="lt1"/>
+                        </a:fillRef>
+                        <a:effectRef idx="0">
+                          <a:schemeClr val="accent2"/>
+                        </a:effectRef>
+                        <a:fontRef idx="minor">
+                          <a:schemeClr val="dk1"/>
+                        </a:fontRef>
+                      </wps:style>
+                      <wps:bodyPr rot="0" spcFirstLastPara="0" vertOverflow="overflow" horzOverflow="overflow" vert="horz" wrap="square" lIns="91440" tIns="45720" rIns="91440" bIns="45720" numCol="1" spcCol="0" rtlCol="0" fromWordArt="0" anchor="ctr" anchorCtr="0" forceAA="0" compatLnSpc="1">
+                        <a:prstTxWarp prst="textNoShape">
+                          <a:avLst/>
+                        </a:prstTxWarp>
+                        <a:noAutofit/>
+                      </wps:bodyPr>
+                    </wps:wsp>
+                  </a:graphicData>
+                </a:graphic>
+                <wp14:sizeRelH relativeFrom="margin">
+                  <wp14:pctWidth>0</wp14:pctWidth>
+                </wp14:sizeRelH>
+                <wp14:sizeRelV relativeFrom="margin">
+                  <wp14:pctHeight>0</wp14:pctHeight>
+                </wp14:sizeRelV>
+              </wp:anchor>
+            </w:drawing>
+          </mc:Choice>
+          <mc:Fallback>
+            <w:pict>
+              <v:rect w14:anchorId="23AA9AAE" id="Rectángulo 19" o:spid="_x0000_s1026" style="position:absolute;margin-left:516.25pt;margin-top:2.85pt;width:571.25pt;height:379.85pt;z-index:251681792;visibility:visible;mso-wrap-style:square;mso-width-percent:0;mso-height-percent:0;mso-wrap-distance-left:9pt;mso-wrap-distance-top:0;mso-wrap-distance-right:9pt;mso-wrap-distance-bottom:0;mso-position-horizontal:absolute;mso-position-horizontal-relative:text;mso-position-vertical:absolute;mso-position-vertical-relative:text;mso-width-percent:0;mso-height-percent:0;mso-width-relative:margin;mso-height-relative:margin;v-text-anchor:middle" o:gfxdata="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" filled="f" strokecolor="#ed7d31 [3205]" strokeweight="1pt"/>
+            </w:pict>
+          </mc:Fallback>
+        </mc:AlternateContent>
+      </w:r>
+    </w:p>
+    <w:p/>
+    <w:p/>
+    <w:p/>
+    <w:p/>
+    <w:p/>
+    <w:p/>
+    <w:p/>
+    <w:p/>
+    <w:p/>
+    <w:p/>
+    <w:p>
+      <w:pPr>
+        <w:tabs>
+          <w:tab w:val="left" w:pos="14173"/>
+        </w:tabs>
+        <w:spacing w:after="0"/>
+        <w:jc w:val="center"/>
+      </w:pPr>
+    </w:p>
+    <w:p>
+      <w:pPr>
+        <w:tabs>
+          <w:tab w:val="left" w:pos="14173"/>
+        </w:tabs>
+        <w:spacing w:after="0"/>
+        <w:jc w:val="center"/>
+      </w:pPr>
+      <w:bookmarkStart w:id="0" w:name="_GoBack"/>
+      <w:bookmarkEnd w:id="0"/>
+      <w:r>
+        <w:rPr>
+          <w:noProof/>
+        </w:rPr>
+        <mc:AlternateContent>
+          <mc:Choice Requires="wps">
+            <w:drawing>
+              <wp:anchor distT="0" distB="0" distL="114300" distR="114300" simplePos="0" relativeHeight="251689984" behindDoc="0" locked="0" layoutInCell="1" allowOverlap="1" wp14:anchorId="2B70C551" wp14:editId="204E838D">
+                <wp:simplePos x="0" y="0"/>
+                <wp:positionH relativeFrom="column">
+                  <wp:posOffset>10544175</wp:posOffset>
+                </wp:positionH>
+                <wp:positionV relativeFrom="paragraph">
+                  <wp:posOffset>13156565</wp:posOffset>
+                </wp:positionV>
+                <wp:extent cx="788035" cy="819785"/>
+                <wp:effectExtent l="0" t="0" r="12065" b="18415"/>
+                <wp:wrapNone/>
+                <wp:docPr id="23" name="Diagrama de flujo: conector 23"/>
+                <wp:cNvGraphicFramePr/>
+                <a:graphic xmlns:a="http://schemas.openxmlformats.org/drawingml/2006/main">
+                  <a:graphicData uri="http://schemas.microsoft.com/office/word/2010/wordprocessingShape">
+                    <wps:wsp>
+                      <wps:cNvSpPr/>
+                      <wps:spPr>
+                        <a:xfrm>
+                          <a:off x="0" y="0"/>
+                          <a:ext cx="788035" cy="819785"/>
+                        </a:xfrm>
+                        <a:prstGeom prst="flowChartConnector">
+                          <a:avLst/>
+                        </a:prstGeom>
+                        <a:noFill/>
+                      </wps:spPr>
+                      <wps:style>
+                        <a:lnRef idx="2">
+                          <a:schemeClr val="accent2"/>
+                        </a:lnRef>
+                        <a:fillRef idx="1">
+                          <a:schemeClr val="lt1"/>
+                        </a:fillRef>
+                        <a:effectRef idx="0">
+                          <a:schemeClr val="accent2"/>
+                        </a:effectRef>
+                        <a:fontRef idx="minor">
+                          <a:schemeClr val="dk1"/>
+                        </a:fontRef>
+                      </wps:style>
+                      <wps:txbx>
+                        <w:txbxContent>
+                          <w:p>
+                            <w:pPr>
+                              <w:jc w:val="center"/>
+                              <w:rPr>
+                                <w:rFonts w:ascii="Times New Roman" w:hAnsi="Times New Roman" w:cs="Times New Roman"/>
+                                <w:color w:val="FFFFFF" w:themeColor="background1"/>
+                                <w:sz w:val="80"/>
+                                <w:szCs w:val="80"/>
+                              </w:rPr>
+                            </w:pPr>
+                          </w:p>
+                        </w:txbxContent>
+                      </wps:txbx>
+                      <wps:bodyPr rot="0" spcFirstLastPara="0" vertOverflow="overflow" horzOverflow="overflow" vert="horz" wrap="square" lIns="91440" tIns="45720" rIns="91440" bIns="45720" numCol="1" spcCol="0" rtlCol="0" fromWordArt="0" anchor="ctr" anchorCtr="0" forceAA="0" compatLnSpc="1">
+                        <a:prstTxWarp prst="textNoShape">
+                          <a:avLst/>
+                        </a:prstTxWarp>
+                        <a:noAutofit/>
+                      </wps:bodyPr>
+                    </wps:wsp>
+                  </a:graphicData>
+                </a:graphic>
+                <wp14:sizeRelH relativeFrom="margin">
+                  <wp14:pctWidth>0</wp14:pctWidth>
+                </wp14:sizeRelH>
+                <wp14:sizeRelV relativeFrom="margin">
+                  <wp14:pctHeight>0</wp14:pctHeight>
+                </wp14:sizeRelV>
+              </wp:anchor>
+            </w:drawing>
+          </mc:Choice>
+          <mc:Fallback>
+            <w:pict>
+              <v:shapetype w14:anchorId="2B70C551" id="_x0000_t120" coordsize="21600,21600" o:spt="120" path="m10800,qx,10800,10800,21600,21600,10800,10800,xe">
+                <v:path gradientshapeok="t" o:connecttype="custom" o:connectlocs="10800,0;3163,3163;0,10800;3163,18437;10800,21600;18437,18437;21600,10800;18437,3163" textboxrect="3163,3163,18437,18437"/>
+              </v:shapetype>
+              <v:shape id="Diagrama de flujo: conector 23" o:spid="_x0000_s1030" type="#_x0000_t120" style="position:absolute;left:0;text-align:left;margin-left:830.25pt;margin-top:1035.95pt;width:62.05pt;height:64.55pt;z-index:251689984;visibility:visible;mso-wrap-style:square;mso-width-percent:0;mso-height-percent:0;mso-wrap-distance-left:9pt;mso-wrap-distance-top:0;mso-wrap-distance-right:9pt;mso-wrap-distance-bottom:0;mso-position-horizontal:absolute;mso-position-horizontal-relative:text;mso-position-vertical:absolute;mso-position-vertical-relative:text;mso-width-percent:0;mso-height-percent:0;mso-width-relative:margin;mso-height-relative:margin;v-text-anchor:middle" o:gfxdata="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" filled="f" strokecolor="#ed7d31 [3205]" strokeweight="1pt">
+                <v:stroke joinstyle="miter"/>
+                <v:textbox>
+                  <w:txbxContent>
+                    <w:p>
+                      <w:pPr>
+                        <w:jc w:val="center"/>
+                        <w:rPr>
+                          <w:rFonts w:ascii="Times New Roman" w:hAnsi="Times New Roman" w:cs="Times New Roman"/>
+                          <w:color w:val="FFFFFF" w:themeColor="background1"/>
+                          <w:sz w:val="80"/>
+                          <w:szCs w:val="80"/>
+                        </w:rPr>
+                      </w:pPr>
+                    </w:p>
+                  </w:txbxContent>
+                </v:textbox>
+              </v:shape>
+            </w:pict>
+          </mc:Fallback>
+        </mc:AlternateContent>
+      </w:r>
+      <w:r>
+        <w:rPr>
+          <w:noProof/>
+          <w:color w:val="FFFFFF" w:themeColor="background1"/>
+        </w:rPr>
+        <mc:AlternateContent>
+          <mc:Choice Requires="wps">
+            <w:drawing>
+              <wp:anchor distT="0" distB="0" distL="114300" distR="114300" simplePos="0" relativeHeight="251687936" behindDoc="0" locked="0" layoutInCell="1" allowOverlap="1" wp14:anchorId="047E5DD4" wp14:editId="7EE2399F">
+                <wp:simplePos x="0" y="0"/>
+                <wp:positionH relativeFrom="column">
+                  <wp:posOffset>4098816</wp:posOffset>
+                </wp:positionH>
+                <wp:positionV relativeFrom="paragraph">
+                  <wp:posOffset>1896088</wp:posOffset>
+                </wp:positionV>
+                <wp:extent cx="12517820" cy="5328745"/>
+                <wp:effectExtent l="0" t="0" r="17145" b="24765"/>
+                <wp:wrapNone/>
+                <wp:docPr id="22" name="Rectángulo 22"/>
+                <wp:cNvGraphicFramePr/>
+                <a:graphic xmlns:a="http://schemas.openxmlformats.org/drawingml/2006/main">
+                  <a:graphicData uri="http://schemas.microsoft.com/office/word/2010/wordprocessingShape">
+                    <wps:wsp>
+                      <wps:cNvSpPr/>
+                      <wps:spPr>
+                        <a:xfrm>
+                          <a:off x="0" y="0"/>
+                          <a:ext cx="12517820" cy="5328745"/>
+                        </a:xfrm>
+                        <a:prstGeom prst="rect">
+                          <a:avLst/>
+                        </a:prstGeom>
+                        <a:noFill/>
+                        <a:ln>
+                          <a:prstDash val="sysDash"/>
+                        </a:ln>
+                      </wps:spPr>
+                      <wps:style>
+                        <a:lnRef idx="2">
+                          <a:schemeClr val="accent2"/>
+                        </a:lnRef>
+                        <a:fillRef idx="1">
+                          <a:schemeClr val="lt1"/>
+                        </a:fillRef>
+                        <a:effectRef idx="0">
+                          <a:schemeClr val="accent2"/>
+                        </a:effectRef>
+                        <a:fontRef idx="minor">
+                          <a:schemeClr val="dk1"/>
+                        </a:fontRef>
+                      </wps:style>
+                      <wps:bodyPr rot="0" spcFirstLastPara="0" vertOverflow="overflow" horzOverflow="overflow" vert="horz" wrap="square" lIns="91440" tIns="45720" rIns="91440" bIns="45720" numCol="1" spcCol="0" rtlCol="0" fromWordArt="0" anchor="ctr" anchorCtr="0" forceAA="0" compatLnSpc="1">
+                        <a:prstTxWarp prst="textNoShape">
+                          <a:avLst/>
+                        </a:prstTxWarp>
+                        <a:noAutofit/>
+                      </wps:bodyPr>
+                    </wps:wsp>
+                  </a:graphicData>
+                </a:graphic>
+                <wp14:sizeRelH relativeFrom="margin">
+                  <wp14:pctWidth>0</wp14:pctWidth>
+                </wp14:sizeRelH>
+                <wp14:sizeRelV relativeFrom="margin">
+                  <wp14:pctHeight>0</wp14:pctHeight>
+                </wp14:sizeRelV>
+              </wp:anchor>
+            </w:drawing>
+          </mc:Choice>
+          <mc:Fallback>
+            <w:pict>
+              <v:rect w14:anchorId="66A43B45" id="Rectángulo 22" o:spid="_x0000_s1026" style="position:absolute;margin-left:322.75pt;margin-top:149.3pt;width:985.65pt;height:419.6pt;z-index:251687936;visibility:visible;mso-wrap-style:square;mso-width-percent:0;mso-height-percent:0;mso-wrap-distance-left:9pt;mso-wrap-distance-top:0;mso-wrap-distance-right:9pt;mso-wrap-distance-bottom:0;mso-position-horizontal:absolute;mso-position-horizontal-relative:text;mso-position-vertical:absolute;mso-position-vertical-relative:text;mso-width-percent:0;mso-height-percent:0;mso-width-relative:margin;mso-height-relative:margin;v-text-anchor:middle" o:gfxdata="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" filled="f" strokecolor="#ed7d31 [3205]" strokeweight="1pt">
+                <v:stroke dashstyle="3 1"/>
+              </v:rect>
+            </w:pict>
+          </mc:Fallback>
+        </mc:AlternateContent>
+      </w:r>
+      <w:r>
+        <w:rPr>
+          <w:noProof/>
+        </w:rPr>
+        <mc:AlternateContent>
+          <mc:Choice Requires="wps">
+            <w:drawing>
+              <wp:anchor distT="0" distB="0" distL="114300" distR="114300" simplePos="0" relativeHeight="251685888" behindDoc="0" locked="0" layoutInCell="1" allowOverlap="1" wp14:anchorId="5E86D196" wp14:editId="7523502A">
+                <wp:simplePos x="0" y="0"/>
+                <wp:positionH relativeFrom="column">
+                  <wp:posOffset>851119</wp:posOffset>
+                </wp:positionH>
+                <wp:positionV relativeFrom="paragraph">
+                  <wp:posOffset>9179756</wp:posOffset>
+                </wp:positionV>
+                <wp:extent cx="18432145" cy="3626069"/>
+                <wp:effectExtent l="0" t="0" r="27305" b="12700"/>
+                <wp:wrapNone/>
+                <wp:docPr id="21" name="Rectángulo 21"/>
+                <wp:cNvGraphicFramePr/>
+                <a:graphic xmlns:a="http://schemas.openxmlformats.org/drawingml/2006/main">
+                  <a:graphicData uri="http://schemas.microsoft.com/office/word/2010/wordprocessingShape">
+                    <wps:wsp>
+                      <wps:cNvSpPr/>
+                      <wps:spPr>
+                        <a:xfrm>
+                          <a:off x="0" y="0"/>
+                          <a:ext cx="18432145" cy="3626069"/>
+                        </a:xfrm>
+                        <a:prstGeom prst="rect">
+                          <a:avLst/>
+                        </a:prstGeom>
+                        <a:noFill/>
+                      </wps:spPr>
+                      <wps:style>
+                        <a:lnRef idx="2">
+                          <a:schemeClr val="accent2"/>
+                        </a:lnRef>
+                        <a:fillRef idx="1">
+                          <a:schemeClr val="lt1"/>
+                        </a:fillRef>
+                        <a:effectRef idx="0">
+                          <a:schemeClr val="accent2"/>
+                        </a:effectRef>
+                        <a:fontRef idx="minor">
+                          <a:schemeClr val="dk1"/>
+                        </a:fontRef>
+                      </wps:style>
+                      <wps:txbx>
+                        <w:txbxContent>
+                          <w:p>
+                            <w:pPr>
+                              <w:jc w:val="center"/>
+                              <w:rPr>
+                                <w:rFonts w:ascii="Times New Roman" w:hAnsi="Times New Roman" w:cs="Times New Roman"/>
+                                <w:color w:val="FFFFFF" w:themeColor="background1"/>
+                                <w:sz w:val="80"/>
+                                <w:szCs w:val="80"/>
+                              </w:rPr>
+                            </w:pPr>
+                            <w:r>
+                              <w:rPr>
+                                <w:rFonts w:ascii="Times New Roman" w:hAnsi="Times New Roman" w:cs="Times New Roman"/>
+                                <w:color w:val="FFFFFF" w:themeColor="background1"/>
+                                <w:sz w:val="80"/>
+                                <w:szCs w:val="80"/>
+                              </w:rPr>
+                              <w:t>GALERIA DE IMAGENES</w:t>
+                            </w:r>
+                          </w:p>
+                        </w:txbxContent>
+                      </wps:txbx>
+                      <wps:bodyPr rot="0" spcFirstLastPara="0" vertOverflow="overflow" horzOverflow="overflow" vert="horz" wrap="square" lIns="91440" tIns="45720" rIns="91440" bIns="45720" numCol="1" spcCol="0" rtlCol="0" fromWordArt="0" anchor="ctr" anchorCtr="0" forceAA="0" compatLnSpc="1">
+                        <a:prstTxWarp prst="textNoShape">
+                          <a:avLst/>
+                        </a:prstTxWarp>
+                        <a:noAutofit/>
+                      </wps:bodyPr>
+                    </wps:wsp>
+                  </a:graphicData>
+                </a:graphic>
+                <wp14:sizeRelH relativeFrom="margin">
+                  <wp14:pctWidth>0</wp14:pctWidth>
+                </wp14:sizeRelH>
+                <wp14:sizeRelV relativeFrom="margin">
+                  <wp14:pctHeight>0</wp14:pctHeight>
+                </wp14:sizeRelV>
+              </wp:anchor>
+            </w:drawing>
+          </mc:Choice>
+          <mc:Fallback>
+            <w:pict>
+              <v:rect w14:anchorId="5E86D196" id="Rectángulo 21" o:spid="_x0000_s1031" style="position:absolute;left:0;text-align:left;margin-left:67pt;margin-top:722.8pt;width:1451.35pt;height:285.5pt;z-index:251685888;visibility:visible;mso-wrap-style:square;mso-width-percent:0;mso-height-percent:0;mso-wrap-distance-left:9pt;mso-wrap-distance-top:0;mso-wrap-distance-right:9pt;mso-wrap-distance-bottom:0;mso-position-horizontal:absolute;mso-position-horizontal-relative:text;mso-position-vertical:absolute;mso-position-vertical-relative:text;mso-width-percent:0;mso-height-percent:0;mso-width-relative:margin;mso-height-relative:margin;v-text-anchor:middle" o:gfxdata="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" filled="f" strokecolor="#ed7d31 [3205]" strokeweight="1pt">
+                <v:textbox>
+                  <w:txbxContent>
+                    <w:p>
+                      <w:pPr>
+                        <w:jc w:val="center"/>
+                        <w:rPr>
+                          <w:rFonts w:ascii="Times New Roman" w:hAnsi="Times New Roman" w:cs="Times New Roman"/>
+                          <w:color w:val="FFFFFF" w:themeColor="background1"/>
+                          <w:sz w:val="80"/>
+                          <w:szCs w:val="80"/>
+                        </w:rPr>
+                      </w:pPr>
+                      <w:r>
+                        <w:rPr>
+                          <w:rFonts w:ascii="Times New Roman" w:hAnsi="Times New Roman" w:cs="Times New Roman"/>
+                          <w:color w:val="FFFFFF" w:themeColor="background1"/>
+                          <w:sz w:val="80"/>
+                          <w:szCs w:val="80"/>
+                        </w:rPr>
+                        <w:t>GALERIA DE IMAGENES</w:t>
+                      </w:r>
+                    </w:p>
+                  </w:txbxContent>
+                </v:textbox>
+              </v:rect>
+            </w:pict>
+          </mc:Fallback>
+        </mc:AlternateContent>
+      </w:r>
+      <w:r>
+        <w:rPr>
+          <w:noProof/>
+        </w:rPr>
+        <mc:AlternateContent>
+          <mc:Choice Requires="wps">
+            <w:drawing>
+              <wp:anchor distT="0" distB="0" distL="114300" distR="114300" simplePos="0" relativeHeight="251675648" behindDoc="0" locked="0" layoutInCell="1" allowOverlap="1" wp14:anchorId="01CE3A9A" wp14:editId="5FAAE482">
+                <wp:simplePos x="0" y="0"/>
+                <wp:positionH relativeFrom="column">
+                  <wp:posOffset>630402</wp:posOffset>
+                </wp:positionH>
+                <wp:positionV relativeFrom="paragraph">
+                  <wp:posOffset>14224723</wp:posOffset>
+                </wp:positionV>
+                <wp:extent cx="19202400" cy="1390518"/>
+                <wp:effectExtent l="0" t="0" r="19050" b="19685"/>
+                <wp:wrapNone/>
+                <wp:docPr id="9" name="Rectángulo 9"/>
+                <wp:cNvGraphicFramePr/>
+                <a:graphic xmlns:a="http://schemas.openxmlformats.org/drawingml/2006/main">
+                  <a:graphicData uri="http://schemas.microsoft.com/office/word/2010/wordprocessingShape">
+                    <wps:wsp>
+                      <wps:cNvSpPr/>
+                      <wps:spPr>
+                        <a:xfrm>
+                          <a:off x="0" y="0"/>
+                          <a:ext cx="19202400" cy="1390518"/>
+                        </a:xfrm>
+                        <a:prstGeom prst="rect">
+                          <a:avLst/>
+                        </a:prstGeom>
+                        <a:noFill/>
+                      </wps:spPr>
+                      <wps:style>
+                        <a:lnRef idx="2">
+                          <a:schemeClr val="accent2"/>
+                        </a:lnRef>
+                        <a:fillRef idx="1">
+                          <a:schemeClr val="lt1"/>
+                        </a:fillRef>
+                        <a:effectRef idx="0">
+                          <a:schemeClr val="accent2"/>
+                        </a:effectRef>
+                        <a:fontRef idx="minor">
+                          <a:schemeClr val="dk1"/>
+                        </a:fontRef>
+                      </wps:style>
+                      <wps:txbx>
+                        <w:txbxContent>
+                          <w:p>
+                            <w:pPr>
+                              <w:jc w:val="center"/>
+                              <w:rPr>
+                                <w:rFonts w:ascii="Times New Roman" w:hAnsi="Times New Roman" w:cs="Times New Roman"/>
+                                <w:color w:val="FFFFFF" w:themeColor="background1"/>
+                                <w:sz w:val="144"/>
+                              </w:rPr>
+                            </w:pPr>
+                            <w:r>
+                              <w:rPr>
+                                <w:rFonts w:ascii="Times New Roman" w:hAnsi="Times New Roman" w:cs="Times New Roman"/>
+                                <w:color w:val="FFFFFF" w:themeColor="background1"/>
+                                <w:sz w:val="144"/>
+                              </w:rPr>
+                              <w:t>PIE DE PAGINA</w:t>
+                            </w:r>
+                          </w:p>
+                        </w:txbxContent>
+                      </wps:txbx>
+                      <wps:bodyPr rot="0" spcFirstLastPara="0" vertOverflow="overflow" horzOverflow="overflow" vert="horz" wrap="square" lIns="91440" tIns="45720" rIns="91440" bIns="45720" numCol="1" spcCol="0" rtlCol="0" fromWordArt="0" anchor="ctr" anchorCtr="0" forceAA="0" compatLnSpc="1">
+                        <a:prstTxWarp prst="textNoShape">
+                          <a:avLst/>
+                        </a:prstTxWarp>
+                        <a:noAutofit/>
+                      </wps:bodyPr>
+                    </wps:wsp>
+                  </a:graphicData>
+                </a:graphic>
+                <wp14:sizeRelH relativeFrom="margin">
+                  <wp14:pctWidth>0</wp14:pctWidth>
+                </wp14:sizeRelH>
+                <wp14:sizeRelV relativeFrom="margin">
+                  <wp14:pctHeight>0</wp14:pctHeight>
+                </wp14:sizeRelV>
+              </wp:anchor>
+            </w:drawing>
+          </mc:Choice>
+          <mc:Fallback>
+            <w:pict>
+              <v:rect w14:anchorId="01CE3A9A" id="Rectángulo 9" o:spid="_x0000_s1032" style="position:absolute;left:0;text-align:left;margin-left:49.65pt;margin-top:1120.05pt;width:21in;height:109.5pt;z-index:251675648;visibility:visible;mso-wrap-style:square;mso-width-percent:0;mso-height-percent:0;mso-wrap-distance-left:9pt;mso-wrap-distance-top:0;mso-wrap-distance-right:9pt;mso-wrap-distance-bottom:0;mso-position-horizontal:absolute;mso-position-horizontal-relative:text;mso-position-vertical:absolute;mso-position-vertical-relative:text;mso-width-percent:0;mso-height-percent:0;mso-width-relative:margin;mso-height-relative:margin;v-text-anchor:middle" o:gfxdata="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" filled="f" strokecolor="#ed7d31 [3205]" strokeweight="1pt">
+                <v:textbox>
+                  <w:txbxContent>
+                    <w:p>
+                      <w:pPr>
+                        <w:jc w:val="center"/>
+                        <w:rPr>
+                          <w:rFonts w:ascii="Times New Roman" w:hAnsi="Times New Roman" w:cs="Times New Roman"/>
+                          <w:color w:val="FFFFFF" w:themeColor="background1"/>
+                          <w:sz w:val="144"/>
+                        </w:rPr>
+                      </w:pPr>
+                      <w:r>
+                        <w:rPr>
+                          <w:rFonts w:ascii="Times New Roman" w:hAnsi="Times New Roman" w:cs="Times New Roman"/>
+                          <w:color w:val="FFFFFF" w:themeColor="background1"/>
+                          <w:sz w:val="144"/>
+                        </w:rPr>
+                        <w:t>PIE DE PAGINA</w:t>
+                      </w:r>
+                    </w:p>
+                  </w:txbxContent>
+                </v:textbox>
+              </v:rect>
+            </w:pict>
+          </mc:Fallback>
+        </mc:AlternateContent>
+      </w:r>
+      <w:r>
+        <w:rPr>
+          <w:noProof/>
+        </w:rPr>
+        <mc:AlternateContent>
+          <mc:Choice Requires="wps">
+            <w:drawing>
+              <wp:anchor distT="0" distB="0" distL="114300" distR="114300" simplePos="0" relativeHeight="251683840" behindDoc="0" locked="0" layoutInCell="1" allowOverlap="1" wp14:anchorId="0D8ED2D6" wp14:editId="3B3B2061">
+                <wp:simplePos x="0" y="0"/>
+                <wp:positionH relativeFrom="column">
+                  <wp:posOffset>875665</wp:posOffset>
+                </wp:positionH>
+                <wp:positionV relativeFrom="paragraph">
+                  <wp:posOffset>7654290</wp:posOffset>
+                </wp:positionV>
+                <wp:extent cx="18432145" cy="1178560"/>
+                <wp:effectExtent l="0" t="0" r="27305" b="21590"/>
+                <wp:wrapNone/>
+                <wp:docPr id="20" name="Rectángulo 20"/>
+                <wp:cNvGraphicFramePr/>
+                <a:graphic xmlns:a="http://schemas.openxmlformats.org/drawingml/2006/main">
+                  <a:graphicData uri="http://schemas.microsoft.com/office/word/2010/wordprocessingShape">
+                    <wps:wsp>
+                      <wps:cNvSpPr/>
+                      <wps:spPr>
+                        <a:xfrm>
+                          <a:off x="0" y="0"/>
+                          <a:ext cx="18432145" cy="1178560"/>
+                        </a:xfrm>
+                        <a:prstGeom prst="rect">
+                          <a:avLst/>
+                        </a:prstGeom>
+                        <a:noFill/>
+                      </wps:spPr>
+                      <wps:style>
+                        <a:lnRef idx="2">
+                          <a:schemeClr val="accent2"/>
+                        </a:lnRef>
+                        <a:fillRef idx="1">
+                          <a:schemeClr val="lt1"/>
+                        </a:fillRef>
+                        <a:effectRef idx="0">
+                          <a:schemeClr val="accent2"/>
+                        </a:effectRef>
+                        <a:fontRef idx="minor">
+                          <a:schemeClr val="dk1"/>
+                        </a:fontRef>
+                      </wps:style>
+                      <wps:txbx>
+                        <w:txbxContent>
+                          <w:p>
+                            <w:pPr>
+                              <w:jc w:val="center"/>
+                              <w:rPr>
+                                <w:rFonts w:ascii="Times New Roman" w:hAnsi="Times New Roman" w:cs="Times New Roman"/>
+                                <w:color w:val="FFFFFF" w:themeColor="background1"/>
+                                <w:sz w:val="80"/>
+                                <w:szCs w:val="80"/>
+                              </w:rPr>
+                            </w:pPr>
+                            <w:r>
+                              <w:rPr>
+                                <w:rFonts w:ascii="Times New Roman" w:hAnsi="Times New Roman" w:cs="Times New Roman"/>
+                                <w:color w:val="FFFFFF" w:themeColor="background1"/>
+                                <w:sz w:val="80"/>
+                                <w:szCs w:val="80"/>
+                              </w:rPr>
+                              <w:t>512 x 154</w:t>
+                            </w:r>
+                          </w:p>
+                        </w:txbxContent>
+                      </wps:txbx>
+                      <wps:bodyPr rot="0" spcFirstLastPara="0" vertOverflow="overflow" horzOverflow="overflow" vert="horz" wrap="square" lIns="91440" tIns="45720" rIns="91440" bIns="45720" numCol="1" spcCol="0" rtlCol="0" fromWordArt="0" anchor="ctr" anchorCtr="0" forceAA="0" compatLnSpc="1">
+                        <a:prstTxWarp prst="textNoShape">
+                          <a:avLst/>
+                        </a:prstTxWarp>
+                        <a:noAutofit/>
+                      </wps:bodyPr>
+                    </wps:wsp>
+                  </a:graphicData>
+                </a:graphic>
+                <wp14:sizeRelH relativeFrom="margin">
+                  <wp14:pctWidth>0</wp14:pctWidth>
+                </wp14:sizeRelH>
+                <wp14:sizeRelV relativeFrom="margin">
+                  <wp14:pctHeight>0</wp14:pctHeight>
+                </wp14:sizeRelV>
+              </wp:anchor>
+            </w:drawing>
+          </mc:Choice>
+          <mc:Fallback>
+            <w:pict>
+              <v:rect w14:anchorId="0D8ED2D6" id="Rectángulo 20" o:spid="_x0000_s1033" style="position:absolute;left:0;text-align:left;margin-left:68.95pt;margin-top:602.7pt;width:1451.35pt;height:92.8pt;z-index:251683840;visibility:visible;mso-wrap-style:square;mso-width-percent:0;mso-height-percent:0;mso-wrap-distance-left:9pt;mso-wrap-distance-top:0;mso-wrap-distance-right:9pt;mso-wrap-distance-bottom:0;mso-position-horizontal:absolute;mso-position-horizontal-relative:text;mso-position-vertical:absolute;mso-position-vertical-relative:text;mso-width-percent:0;mso-height-percent:0;mso-width-relative:margin;mso-height-relative:margin;v-text-anchor:middle" o:gfxdata="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" filled="f" strokecolor="#ed7d31 [3205]" strokeweight="1pt">
+                <v:textbox>
+                  <w:txbxContent>
+                    <w:p>
+                      <w:pPr>
+                        <w:jc w:val="center"/>
+                        <w:rPr>
+                          <w:rFonts w:ascii="Times New Roman" w:hAnsi="Times New Roman" w:cs="Times New Roman"/>
+                          <w:color w:val="FFFFFF" w:themeColor="background1"/>
+                          <w:sz w:val="80"/>
+                          <w:szCs w:val="80"/>
+                        </w:rPr>
+                      </w:pPr>
+                      <w:r>
+                        <w:rPr>
+                          <w:rFonts w:ascii="Times New Roman" w:hAnsi="Times New Roman" w:cs="Times New Roman"/>
+                          <w:color w:val="FFFFFF" w:themeColor="background1"/>
+                          <w:sz w:val="80"/>
+                          <w:szCs w:val="80"/>
+                        </w:rPr>
+                        <w:t>512 x 154</w:t>
+                      </w:r>
+                    </w:p>
+                  </w:txbxContent>
+                </v:textbox>
               </v:rect>
             </w:pict>
           </mc:Fallback>
@@ -1160,7 +2084,7 @@
   <w:style w:type="paragraph" w:default="1" w:styleId="Normal">
     <w:name w:val="Normal"/>
     <w:qFormat/>
-    <w:rsid w:val="00EB22E0"/>
+    <w:rsid w:val="00387944"/>
   </w:style>
   <w:style w:type="paragraph" w:styleId="Ttulo1">
     <w:name w:val="heading 1"/>
@@ -1526,7 +2450,7 @@
 </file>
 
 <file path=customXml/itemProps1.xml><?xml version="1.0" encoding="utf-8"?>
-<ds:datastoreItem xmlns:ds="http://schemas.openxmlformats.org/officeDocument/2006/customXml" ds:itemID="{1FD476DA-AD12-4777-B83E-FC4DF66ABD15}">
+<ds:datastoreItem xmlns:ds="http://schemas.openxmlformats.org/officeDocument/2006/customXml" ds:itemID="{A0ED3B25-933B-4FEA-81E2-81751FA59F42}">
   <ds:schemaRefs>
     <ds:schemaRef ds:uri="http://schemas.openxmlformats.org/officeDocument/2006/bibliography"/>
   </ds:schemaRefs>

</xml_diff>